<commit_message>
feat: add complete bilingual resume pipeline with 4 dedicated Indonesian ATS resume variants
</commit_message>
<xml_diff>
--- a/output/Muhamad_Hendri_Febriansyah_Resume.docx
+++ b/output/Muhamad_Hendri_Febriansyah_Resume.docx
@@ -4,55 +4,60 @@
   <w:body>
     <w:p>
       <w:pPr>
-        <w:spacing w:before="0" w:after="40"/>
+        <w:spacing w:before="0" w:after="20"/>
         <w:jc w:val="center"/>
       </w:pPr>
       <w:r>
         <w:rPr>
+          <w:rFonts w:ascii="Calibri" w:hAnsi="Calibri"/>
           <w:b/>
-          <w:color w:val="18212F"/>
-          <w:sz w:val="32"/>
+          <w:color w:val="0F172A"/>
+          <w:sz w:val="36"/>
         </w:rPr>
         <w:t>MUHAMAD HENDRI FEBRIANSYAH</w:t>
       </w:r>
     </w:p>
     <w:p>
       <w:pPr>
-        <w:spacing w:before="0" w:after="120"/>
+        <w:spacing w:before="0" w:after="80"/>
         <w:jc w:val="center"/>
       </w:pPr>
       <w:r>
         <w:rPr>
+          <w:rFonts w:ascii="Calibri" w:hAnsi="Calibri"/>
           <w:color w:val="475569"/>
-          <w:sz w:val="19"/>
+          <w:sz w:val="18"/>
         </w:rPr>
-        <w:t>Surabaya / Jakarta, Indonesia  |  hendrifebriansyah28@gmail.com  |  +62 896 9827 7267  |  linkedin.com/in/hendrifebriansyah  |  Portfolio</w:t>
+        <w:t>Surabaya / Jakarta, Indonesia  •  hendrifebriansyah28@gmail.com  •  +62 896 9827 7267  •  LinkedIn: linkedin.com/in/hendrifebriansyah  •  GitHub: github.com/hendrifebriansyah  •  Portfolio: Portfolio</w:t>
       </w:r>
     </w:p>
     <w:p>
       <w:pPr>
         <w:keepNext/>
-        <w:spacing w:before="160" w:after="60"/>
+        <w:spacing w:before="140" w:after="40"/>
         <w:pBdr>
-          <w:bottom w:val="single" w:sz="6" w:space="2" w:color="18212F"/>
+          <w:bottom w:val="single" w:sz="6" w:space="1" w:color="2563EB"/>
         </w:pBdr>
       </w:pPr>
       <w:r>
         <w:rPr>
+          <w:rFonts w:ascii="Calibri" w:hAnsi="Calibri"/>
           <w:b/>
-          <w:color w:val="18212F"/>
-          <w:sz w:val="23"/>
+          <w:color w:val="2563EB"/>
+          <w:sz w:val="21"/>
         </w:rPr>
-        <w:t>SUMMARY</w:t>
+        <w:t>PROFESSIONAL SUMMARY</w:t>
       </w:r>
     </w:p>
     <w:p>
       <w:pPr>
-        <w:spacing w:before="40" w:after="80" w:line="276" w:lineRule="auto"/>
+        <w:spacing w:before="20" w:after="80" w:line="269" w:lineRule="auto"/>
       </w:pPr>
       <w:r>
         <w:rPr>
-          <w:sz w:val="20"/>
+          <w:rFonts w:ascii="Calibri" w:hAnsi="Calibri"/>
+          <w:color w:val="1E293B"/>
+          <w:sz w:val="19"/>
         </w:rPr>
         <w:t>Results-driven Software Engineer with over 6 years of experience architecting and delivering scalable Web2 and Web3 applications. Proven frontend &amp; full-stack expertise across modern technologies including React 19, React Router v7, TypeScript, Tailwind CSS v4, shadcn/ui, TanStack Query/Table, Laravel, native Android (Kotlin, Jetpack), and decentralized solutions (Solidity, TON SDK). Demonstrated track record building real-time operational traffic monitoring dashboards (NTMC), optimizing flagship mobile apps serving 1.5M+ users (38.6% size reduction, 99.42% crash-free stability), and developing high-concurrency Telegram AI assistants with crypto payments. Adept in Agile leadership, type-safe clean architecture, and cross-functional team collaboration.</w:t>
       </w:r>
@@ -60,18 +65,19 @@
     <w:p>
       <w:pPr>
         <w:keepNext/>
-        <w:spacing w:before="160" w:after="60"/>
+        <w:spacing w:before="140" w:after="40"/>
         <w:pBdr>
-          <w:bottom w:val="single" w:sz="6" w:space="2" w:color="18212F"/>
+          <w:bottom w:val="single" w:sz="6" w:space="1" w:color="2563EB"/>
         </w:pBdr>
       </w:pPr>
       <w:r>
         <w:rPr>
+          <w:rFonts w:ascii="Calibri" w:hAnsi="Calibri"/>
           <w:b/>
-          <w:color w:val="18212F"/>
-          <w:sz w:val="23"/>
+          <w:color w:val="2563EB"/>
+          <w:sz w:val="21"/>
         </w:rPr>
-        <w:t>EXPERIENCE</w:t>
+        <w:t>WORK EXPERIENCE</w:t>
       </w:r>
     </w:p>
     <w:tbl>
@@ -82,29 +88,30 @@
         <w:tblLook w:firstColumn="1" w:firstRow="1" w:lastColumn="0" w:lastRow="0" w:noHBand="0" w:noVBand="1" w:val="04A0"/>
       </w:tblPr>
       <w:tblGrid>
-        <w:gridCol w:w="7776"/>
-        <w:gridCol w:w="2736"/>
+        <w:gridCol w:w="5400"/>
+        <w:gridCol w:w="5400"/>
       </w:tblGrid>
       <w:tr>
         <w:tc>
           <w:tcPr>
-            <w:tcW w:type="dxa" w:w="5256"/>
+            <w:tcW w:type="dxa" w:w="8064"/>
             <w:tcMar>
-              <w:top w:w="20" w:type="dxa"/>
-              <w:bottom w:w="5" w:type="dxa"/>
+              <w:top w:w="0" w:type="dxa"/>
+              <w:bottom w:w="0" w:type="dxa"/>
               <w:left w:w="0" w:type="dxa"/>
               <w:right w:w="0" w:type="dxa"/>
             </w:tcMar>
           </w:tcPr>
           <w:p>
             <w:pPr>
-              <w:spacing w:before="60" w:after="20"/>
+              <w:spacing w:before="40" w:after="20" w:line="252" w:lineRule="auto"/>
             </w:pPr>
             <w:r>
               <w:rPr>
+                <w:rFonts w:ascii="Calibri" w:hAnsi="Calibri"/>
                 <w:b/>
-                <w:color w:val="18212F"/>
-                <w:sz w:val="21"/>
+                <w:color w:val="0F172A"/>
+                <w:sz w:val="20"/>
               </w:rPr>
               <w:t>Freelance Software Engineer | PT Lapantiga Solusi Algoritma</w:t>
             </w:r>
@@ -112,25 +119,27 @@
         </w:tc>
         <w:tc>
           <w:tcPr>
-            <w:tcW w:type="dxa" w:w="5256"/>
+            <w:tcW w:type="dxa" w:w="2736"/>
             <w:tcMar>
-              <w:top w:w="20" w:type="dxa"/>
-              <w:bottom w:w="5" w:type="dxa"/>
+              <w:top w:w="0" w:type="dxa"/>
+              <w:bottom w:w="0" w:type="dxa"/>
               <w:left w:w="0" w:type="dxa"/>
               <w:right w:w="0" w:type="dxa"/>
             </w:tcMar>
           </w:tcPr>
           <w:p>
             <w:pPr>
-              <w:spacing w:before="60" w:after="20"/>
+              <w:spacing w:before="40" w:after="20" w:line="252" w:lineRule="auto"/>
               <w:jc w:val="right"/>
             </w:pPr>
             <w:r>
               <w:rPr>
+                <w:rFonts w:ascii="Calibri" w:hAnsi="Calibri"/>
+                <w:i/>
                 <w:color w:val="475569"/>
                 <w:sz w:val="19"/>
               </w:rPr>
-              <w:t>Jan 2019 – Present</w:t>
+              <w:t>Surabaya, Indonesia  •  Jan 2019 – Present</w:t>
             </w:r>
           </w:p>
         </w:tc>
@@ -139,11 +148,14 @@
     <w:p>
       <w:pPr>
         <w:pStyle w:val="ListBullet"/>
-        <w:spacing w:before="40" w:after="20" w:line="269" w:lineRule="auto"/>
+        <w:spacing w:before="20" w:after="10" w:line="259" w:lineRule="auto"/>
+        <w:ind w:left="288"/>
       </w:pPr>
       <w:r>
         <w:rPr>
-          <w:sz w:val="20"/>
+          <w:rFonts w:ascii="Calibri" w:hAnsi="Calibri"/>
+          <w:color w:val="1E293B"/>
+          <w:sz w:val="19"/>
         </w:rPr>
         <w:t>Developed the NTMC Dashboard Utama, a mission-critical operational and traffic monitoring web application leveraging React 19, React Router v7, TypeScript, Tailwind CSS v4, and shadcn/ui.</w:t>
       </w:r>
@@ -151,11 +163,14 @@
     <w:p>
       <w:pPr>
         <w:pStyle w:val="ListBullet"/>
-        <w:spacing w:before="20" w:after="20" w:line="269" w:lineRule="auto"/>
+        <w:spacing w:before="0" w:after="10" w:line="259" w:lineRule="auto"/>
+        <w:ind w:left="288"/>
       </w:pPr>
       <w:r>
         <w:rPr>
-          <w:sz w:val="20"/>
+          <w:rFonts w:ascii="Calibri" w:hAnsi="Calibri"/>
+          <w:color w:val="1E293B"/>
+          <w:sz w:val="19"/>
         </w:rPr>
         <w:t>Integrated real-time WebSocket communication using Pusher JS for live incident streaming, instant operational alerts, and dynamic dashboard event updates.</w:t>
       </w:r>
@@ -163,11 +178,14 @@
     <w:p>
       <w:pPr>
         <w:pStyle w:val="ListBullet"/>
-        <w:spacing w:before="20" w:after="20" w:line="269" w:lineRule="auto"/>
+        <w:spacing w:before="0" w:after="10" w:line="259" w:lineRule="auto"/>
+        <w:ind w:left="288"/>
       </w:pPr>
       <w:r>
         <w:rPr>
-          <w:sz w:val="20"/>
+          <w:rFonts w:ascii="Calibri" w:hAnsi="Calibri"/>
+          <w:color w:val="1E293B"/>
+          <w:sz w:val="19"/>
         </w:rPr>
         <w:t>Architected high-performance server-side data tables with TanStack Table v8 and server state caching via TanStack Query v5, supporting complex multi-field filtering, sorting, and pagination across large datasets.</w:t>
       </w:r>
@@ -175,11 +193,14 @@
     <w:p>
       <w:pPr>
         <w:pStyle w:val="ListBullet"/>
-        <w:spacing w:before="20" w:after="20" w:line="269" w:lineRule="auto"/>
+        <w:spacing w:before="0" w:after="10" w:line="259" w:lineRule="auto"/>
+        <w:ind w:left="288"/>
       </w:pPr>
       <w:r>
         <w:rPr>
-          <w:sz w:val="20"/>
+          <w:rFonts w:ascii="Calibri" w:hAnsi="Calibri"/>
+          <w:color w:val="1E293B"/>
+          <w:sz w:val="19"/>
         </w:rPr>
         <w:t>Engineered robust type-safe forms with React Hook Form and Zod schema validation, along with interactive data analytics charts using Recharts.</w:t>
       </w:r>
@@ -187,11 +208,14 @@
     <w:p>
       <w:pPr>
         <w:pStyle w:val="ListBullet"/>
-        <w:spacing w:before="20" w:after="60" w:line="269" w:lineRule="auto"/>
+        <w:spacing w:before="0" w:after="40" w:line="259" w:lineRule="auto"/>
+        <w:ind w:left="288"/>
       </w:pPr>
       <w:r>
         <w:rPr>
-          <w:sz w:val="20"/>
+          <w:rFonts w:ascii="Calibri" w:hAnsi="Calibri"/>
+          <w:color w:val="1E293B"/>
+          <w:sz w:val="19"/>
         </w:rPr>
         <w:t>Previously built backend architectures, virtual event platforms, and CMS solutions using Laravel, Node.js, MySQL, and MongoDB, delivering high-concurrency client solutions on schedule.</w:t>
       </w:r>
@@ -204,29 +228,30 @@
         <w:tblLook w:firstColumn="1" w:firstRow="1" w:lastColumn="0" w:lastRow="0" w:noHBand="0" w:noVBand="1" w:val="04A0"/>
       </w:tblPr>
       <w:tblGrid>
-        <w:gridCol w:w="7776"/>
-        <w:gridCol w:w="2736"/>
+        <w:gridCol w:w="5400"/>
+        <w:gridCol w:w="5400"/>
       </w:tblGrid>
       <w:tr>
         <w:tc>
           <w:tcPr>
-            <w:tcW w:type="dxa" w:w="5256"/>
+            <w:tcW w:type="dxa" w:w="8064"/>
             <w:tcMar>
-              <w:top w:w="20" w:type="dxa"/>
-              <w:bottom w:w="5" w:type="dxa"/>
+              <w:top w:w="0" w:type="dxa"/>
+              <w:bottom w:w="0" w:type="dxa"/>
               <w:left w:w="0" w:type="dxa"/>
               <w:right w:w="0" w:type="dxa"/>
             </w:tcMar>
           </w:tcPr>
           <w:p>
             <w:pPr>
-              <w:spacing w:before="60" w:after="20"/>
+              <w:spacing w:before="40" w:after="20" w:line="252" w:lineRule="auto"/>
             </w:pPr>
             <w:r>
               <w:rPr>
+                <w:rFonts w:ascii="Calibri" w:hAnsi="Calibri"/>
                 <w:b/>
-                <w:color w:val="18212F"/>
-                <w:sz w:val="21"/>
+                <w:color w:val="0F172A"/>
+                <w:sz w:val="20"/>
               </w:rPr>
               <w:t>Full Stack Developer (Web3 &amp; AI) | Kipley Pte. Ltd.</w:t>
             </w:r>
@@ -234,25 +259,27 @@
         </w:tc>
         <w:tc>
           <w:tcPr>
-            <w:tcW w:type="dxa" w:w="5256"/>
+            <w:tcW w:type="dxa" w:w="2736"/>
             <w:tcMar>
-              <w:top w:w="20" w:type="dxa"/>
-              <w:bottom w:w="5" w:type="dxa"/>
+              <w:top w:w="0" w:type="dxa"/>
+              <w:bottom w:w="0" w:type="dxa"/>
               <w:left w:w="0" w:type="dxa"/>
               <w:right w:w="0" w:type="dxa"/>
             </w:tcMar>
           </w:tcPr>
           <w:p>
             <w:pPr>
-              <w:spacing w:before="60" w:after="20"/>
+              <w:spacing w:before="40" w:after="20" w:line="252" w:lineRule="auto"/>
               <w:jc w:val="right"/>
             </w:pPr>
             <w:r>
               <w:rPr>
+                <w:rFonts w:ascii="Calibri" w:hAnsi="Calibri"/>
+                <w:i/>
                 <w:color w:val="475569"/>
                 <w:sz w:val="19"/>
               </w:rPr>
-              <w:t>Nov 2024 – Jul 2025</w:t>
+              <w:t>Singapore (Remote)  •  Nov 2024 – Jul 2025</w:t>
             </w:r>
           </w:p>
         </w:tc>
@@ -261,11 +288,14 @@
     <w:p>
       <w:pPr>
         <w:pStyle w:val="ListBullet"/>
-        <w:spacing w:before="40" w:after="20" w:line="269" w:lineRule="auto"/>
+        <w:spacing w:before="20" w:after="10" w:line="259" w:lineRule="auto"/>
+        <w:ind w:left="288"/>
       </w:pPr>
       <w:r>
         <w:rPr>
-          <w:sz w:val="20"/>
+          <w:rFonts w:ascii="Calibri" w:hAnsi="Calibri"/>
+          <w:color w:val="1E293B"/>
+          <w:sz w:val="19"/>
         </w:rPr>
         <w:t>Built and integrated high-performance REST and GraphQL APIs for 5+ Kipley projects, improving frontend response times by 30% through optimized caching and state management.</w:t>
       </w:r>
@@ -273,11 +303,14 @@
     <w:p>
       <w:pPr>
         <w:pStyle w:val="ListBullet"/>
-        <w:spacing w:before="20" w:after="20" w:line="269" w:lineRule="auto"/>
+        <w:spacing w:before="0" w:after="10" w:line="259" w:lineRule="auto"/>
+        <w:ind w:left="288"/>
       </w:pPr>
       <w:r>
         <w:rPr>
-          <w:sz w:val="20"/>
+          <w:rFonts w:ascii="Calibri" w:hAnsi="Calibri"/>
+          <w:color w:val="1E293B"/>
+          <w:sz w:val="19"/>
         </w:rPr>
         <w:t>Integrated Ethereum smart contracts (Solidity) with Web3 frontend architectures (Next.js, Ethers.js/Wagmi), facilitating secure decentralized transactions for DeFi and NFT features.</w:t>
       </w:r>
@@ -285,11 +318,14 @@
     <w:p>
       <w:pPr>
         <w:pStyle w:val="ListBullet"/>
-        <w:spacing w:before="20" w:after="20" w:line="269" w:lineRule="auto"/>
+        <w:spacing w:before="0" w:after="10" w:line="259" w:lineRule="auto"/>
+        <w:ind w:left="288"/>
       </w:pPr>
       <w:r>
         <w:rPr>
-          <w:sz w:val="20"/>
+          <w:rFonts w:ascii="Calibri" w:hAnsi="Calibri"/>
+          <w:color w:val="1E293B"/>
+          <w:sz w:val="19"/>
         </w:rPr>
         <w:t>Developed a high-concurrency Telegram AI Assistant supporting multichain transactions (TON, USDT, Telegram Stars), enabling real-time user interaction and automated crypto payments.</w:t>
       </w:r>
@@ -297,11 +333,14 @@
     <w:p>
       <w:pPr>
         <w:pStyle w:val="ListBullet"/>
-        <w:spacing w:before="20" w:after="60" w:line="269" w:lineRule="auto"/>
+        <w:spacing w:before="0" w:after="40" w:line="259" w:lineRule="auto"/>
+        <w:ind w:left="288"/>
       </w:pPr>
       <w:r>
         <w:rPr>
-          <w:sz w:val="20"/>
+          <w:rFonts w:ascii="Calibri" w:hAnsi="Calibri"/>
+          <w:color w:val="1E293B"/>
+          <w:sz w:val="19"/>
         </w:rPr>
         <w:t>Collaborated closely with product, UI/UX, and backend teams in an Agile environment to iterate on features, resolve technical blockers, and meet sprint deadlines consistently.</w:t>
       </w:r>
@@ -314,29 +353,30 @@
         <w:tblLook w:firstColumn="1" w:firstRow="1" w:lastColumn="0" w:lastRow="0" w:noHBand="0" w:noVBand="1" w:val="04A0"/>
       </w:tblPr>
       <w:tblGrid>
-        <w:gridCol w:w="7776"/>
-        <w:gridCol w:w="2736"/>
+        <w:gridCol w:w="5400"/>
+        <w:gridCol w:w="5400"/>
       </w:tblGrid>
       <w:tr>
         <w:tc>
           <w:tcPr>
-            <w:tcW w:type="dxa" w:w="5256"/>
+            <w:tcW w:type="dxa" w:w="8064"/>
             <w:tcMar>
-              <w:top w:w="20" w:type="dxa"/>
-              <w:bottom w:w="5" w:type="dxa"/>
+              <w:top w:w="0" w:type="dxa"/>
+              <w:bottom w:w="0" w:type="dxa"/>
               <w:left w:w="0" w:type="dxa"/>
               <w:right w:w="0" w:type="dxa"/>
             </w:tcMar>
           </w:tcPr>
           <w:p>
             <w:pPr>
-              <w:spacing w:before="60" w:after="20"/>
+              <w:spacing w:before="40" w:after="20" w:line="252" w:lineRule="auto"/>
             </w:pPr>
             <w:r>
               <w:rPr>
+                <w:rFonts w:ascii="Calibri" w:hAnsi="Calibri"/>
                 <w:b/>
-                <w:color w:val="18212F"/>
-                <w:sz w:val="21"/>
+                <w:color w:val="0F172A"/>
+                <w:sz w:val="20"/>
               </w:rPr>
               <w:t>Android Developer | PT Aku Pintar Indonesia</w:t>
             </w:r>
@@ -344,25 +384,27 @@
         </w:tc>
         <w:tc>
           <w:tcPr>
-            <w:tcW w:type="dxa" w:w="5256"/>
+            <w:tcW w:type="dxa" w:w="2736"/>
             <w:tcMar>
-              <w:top w:w="20" w:type="dxa"/>
-              <w:bottom w:w="5" w:type="dxa"/>
+              <w:top w:w="0" w:type="dxa"/>
+              <w:bottom w:w="0" w:type="dxa"/>
               <w:left w:w="0" w:type="dxa"/>
               <w:right w:w="0" w:type="dxa"/>
             </w:tcMar>
           </w:tcPr>
           <w:p>
             <w:pPr>
-              <w:spacing w:before="60" w:after="20"/>
+              <w:spacing w:before="40" w:after="20" w:line="252" w:lineRule="auto"/>
               <w:jc w:val="right"/>
             </w:pPr>
             <w:r>
               <w:rPr>
+                <w:rFonts w:ascii="Calibri" w:hAnsi="Calibri"/>
+                <w:i/>
                 <w:color w:val="475569"/>
                 <w:sz w:val="19"/>
               </w:rPr>
-              <w:t>Feb 2021 – May 2024</w:t>
+              <w:t>Surabaya, Indonesia  •  Feb 2021 – May 2024</w:t>
             </w:r>
           </w:p>
         </w:tc>
@@ -371,11 +413,14 @@
     <w:p>
       <w:pPr>
         <w:pStyle w:val="ListBullet"/>
-        <w:spacing w:before="40" w:after="20" w:line="269" w:lineRule="auto"/>
+        <w:spacing w:before="20" w:after="10" w:line="259" w:lineRule="auto"/>
+        <w:ind w:left="288"/>
       </w:pPr>
       <w:r>
         <w:rPr>
-          <w:sz w:val="20"/>
+          <w:rFonts w:ascii="Calibri" w:hAnsi="Calibri"/>
+          <w:color w:val="1E293B"/>
+          <w:sz w:val="19"/>
         </w:rPr>
         <w:t>Spearheaded native Android development for a flagship education platform with 1.5M+ active users and a 4.42/5.00 Play Store rating.</w:t>
       </w:r>
@@ -383,11 +428,14 @@
     <w:p>
       <w:pPr>
         <w:pStyle w:val="ListBullet"/>
-        <w:spacing w:before="20" w:after="20" w:line="269" w:lineRule="auto"/>
+        <w:spacing w:before="0" w:after="10" w:line="259" w:lineRule="auto"/>
+        <w:ind w:left="288"/>
       </w:pPr>
       <w:r>
         <w:rPr>
-          <w:sz w:val="20"/>
+          <w:rFonts w:ascii="Calibri" w:hAnsi="Calibri"/>
+          <w:color w:val="1E293B"/>
+          <w:sz w:val="19"/>
         </w:rPr>
         <w:t>Architected and refactored the app into a modular MVVM structure using Android Jetpack, reducing the application size by 38.6% (from 69.5 MB to 42.7 MB) and boosting runtime performance.</w:t>
       </w:r>
@@ -395,11 +443,14 @@
     <w:p>
       <w:pPr>
         <w:pStyle w:val="ListBullet"/>
-        <w:spacing w:before="20" w:after="20" w:line="269" w:lineRule="auto"/>
+        <w:spacing w:before="0" w:after="10" w:line="259" w:lineRule="auto"/>
+        <w:ind w:left="288"/>
       </w:pPr>
       <w:r>
         <w:rPr>
-          <w:sz w:val="20"/>
+          <w:rFonts w:ascii="Calibri" w:hAnsi="Calibri"/>
+          <w:color w:val="1E293B"/>
+          <w:sz w:val="19"/>
         </w:rPr>
         <w:t>Optimized and maintained core application modules to achieve a 99.42%+ crash-free user rate over continuous 90-day release cycles.</w:t>
       </w:r>
@@ -407,11 +458,14 @@
     <w:p>
       <w:pPr>
         <w:pStyle w:val="ListBullet"/>
-        <w:spacing w:before="20" w:after="60" w:line="269" w:lineRule="auto"/>
+        <w:spacing w:before="0" w:after="40" w:line="259" w:lineRule="auto"/>
+        <w:ind w:left="288"/>
       </w:pPr>
       <w:r>
         <w:rPr>
-          <w:sz w:val="20"/>
+          <w:rFonts w:ascii="Calibri" w:hAnsi="Calibri"/>
+          <w:color w:val="1E293B"/>
+          <w:sz w:val="19"/>
         </w:rPr>
         <w:t>Facilitated bi-weekly agile standups and sprint planning, collaborating cross-functionally to deliver feature releases on schedule.</w:t>
       </w:r>
@@ -424,29 +478,30 @@
         <w:tblLook w:firstColumn="1" w:firstRow="1" w:lastColumn="0" w:lastRow="0" w:noHBand="0" w:noVBand="1" w:val="04A0"/>
       </w:tblPr>
       <w:tblGrid>
-        <w:gridCol w:w="7776"/>
-        <w:gridCol w:w="2736"/>
+        <w:gridCol w:w="5400"/>
+        <w:gridCol w:w="5400"/>
       </w:tblGrid>
       <w:tr>
         <w:tc>
           <w:tcPr>
-            <w:tcW w:type="dxa" w:w="5256"/>
+            <w:tcW w:type="dxa" w:w="8064"/>
             <w:tcMar>
-              <w:top w:w="20" w:type="dxa"/>
-              <w:bottom w:w="5" w:type="dxa"/>
+              <w:top w:w="0" w:type="dxa"/>
+              <w:bottom w:w="0" w:type="dxa"/>
               <w:left w:w="0" w:type="dxa"/>
               <w:right w:w="0" w:type="dxa"/>
             </w:tcMar>
           </w:tcPr>
           <w:p>
             <w:pPr>
-              <w:spacing w:before="60" w:after="20"/>
+              <w:spacing w:before="40" w:after="20" w:line="252" w:lineRule="auto"/>
             </w:pPr>
             <w:r>
               <w:rPr>
+                <w:rFonts w:ascii="Calibri" w:hAnsi="Calibri"/>
                 <w:b/>
-                <w:color w:val="18212F"/>
-                <w:sz w:val="21"/>
+                <w:color w:val="0F172A"/>
+                <w:sz w:val="20"/>
               </w:rPr>
               <w:t>Software Developer | PT Qira Teknologi Indonesia</w:t>
             </w:r>
@@ -454,25 +509,27 @@
         </w:tc>
         <w:tc>
           <w:tcPr>
-            <w:tcW w:type="dxa" w:w="5256"/>
+            <w:tcW w:type="dxa" w:w="2736"/>
             <w:tcMar>
-              <w:top w:w="20" w:type="dxa"/>
-              <w:bottom w:w="5" w:type="dxa"/>
+              <w:top w:w="0" w:type="dxa"/>
+              <w:bottom w:w="0" w:type="dxa"/>
               <w:left w:w="0" w:type="dxa"/>
               <w:right w:w="0" w:type="dxa"/>
             </w:tcMar>
           </w:tcPr>
           <w:p>
             <w:pPr>
-              <w:spacing w:before="60" w:after="20"/>
+              <w:spacing w:before="40" w:after="20" w:line="252" w:lineRule="auto"/>
               <w:jc w:val="right"/>
             </w:pPr>
             <w:r>
               <w:rPr>
+                <w:rFonts w:ascii="Calibri" w:hAnsi="Calibri"/>
+                <w:i/>
                 <w:color w:val="475569"/>
                 <w:sz w:val="19"/>
               </w:rPr>
-              <w:t>Nov 2020 – Jan 2024</w:t>
+              <w:t>Surabaya, Indonesia  •  Nov 2020 – Jan 2024</w:t>
             </w:r>
           </w:p>
         </w:tc>
@@ -481,11 +538,14 @@
     <w:p>
       <w:pPr>
         <w:pStyle w:val="ListBullet"/>
-        <w:spacing w:before="40" w:after="20" w:line="269" w:lineRule="auto"/>
+        <w:spacing w:before="20" w:after="10" w:line="259" w:lineRule="auto"/>
+        <w:ind w:left="288"/>
       </w:pPr>
       <w:r>
         <w:rPr>
-          <w:sz w:val="20"/>
+          <w:rFonts w:ascii="Calibri" w:hAnsi="Calibri"/>
+          <w:color w:val="1E293B"/>
+          <w:sz w:val="19"/>
         </w:rPr>
         <w:t>Developed secure, scalable web-based back-end systems (online assessments, e-commerce, CRM, and CMS) utilizing PHP, Laravel, MySQL, and RESTful APIs.</w:t>
       </w:r>
@@ -493,11 +553,14 @@
     <w:p>
       <w:pPr>
         <w:pStyle w:val="ListBullet"/>
-        <w:spacing w:before="20" w:after="20" w:line="269" w:lineRule="auto"/>
+        <w:spacing w:before="0" w:after="10" w:line="259" w:lineRule="auto"/>
+        <w:ind w:left="288"/>
       </w:pPr>
       <w:r>
         <w:rPr>
-          <w:sz w:val="20"/>
+          <w:rFonts w:ascii="Calibri" w:hAnsi="Calibri"/>
+          <w:color w:val="1E293B"/>
+          <w:sz w:val="19"/>
         </w:rPr>
         <w:t>Integrated end-to-end payment gateway workflows (Midtrans, Moota) and Google API services, ensuring 99.9% billing transaction accuracy and seamless automated reconciliation.</w:t>
       </w:r>
@@ -505,11 +568,14 @@
     <w:p>
       <w:pPr>
         <w:pStyle w:val="ListBullet"/>
-        <w:spacing w:before="20" w:after="20" w:line="269" w:lineRule="auto"/>
+        <w:spacing w:before="0" w:after="10" w:line="259" w:lineRule="auto"/>
+        <w:ind w:left="288"/>
       </w:pPr>
       <w:r>
         <w:rPr>
-          <w:sz w:val="20"/>
+          <w:rFonts w:ascii="Calibri" w:hAnsi="Calibri"/>
+          <w:color w:val="1E293B"/>
+          <w:sz w:val="19"/>
         </w:rPr>
         <w:t>Engineered companion native Android applications utilizing Java, Kotlin, Android Jetpack, and Firebase for real-time synchronization and intuitive user experiences.</w:t>
       </w:r>
@@ -517,11 +583,14 @@
     <w:p>
       <w:pPr>
         <w:pStyle w:val="ListBullet"/>
-        <w:spacing w:before="20" w:after="60" w:line="269" w:lineRule="auto"/>
+        <w:spacing w:before="0" w:after="40" w:line="259" w:lineRule="auto"/>
+        <w:ind w:left="288"/>
       </w:pPr>
       <w:r>
         <w:rPr>
-          <w:sz w:val="20"/>
+          <w:rFonts w:ascii="Calibri" w:hAnsi="Calibri"/>
+          <w:color w:val="1E293B"/>
+          <w:sz w:val="19"/>
         </w:rPr>
         <w:t>Configured deployment pipelines and server environments across Linux/SSH, cPanel, and Plesk, ensuring high availability and zero-downtime releases.</w:t>
       </w:r>
@@ -529,124 +598,149 @@
     <w:p>
       <w:pPr>
         <w:keepNext/>
-        <w:spacing w:before="160" w:after="60"/>
+        <w:spacing w:before="140" w:after="40"/>
         <w:pBdr>
-          <w:bottom w:val="single" w:sz="6" w:space="2" w:color="18212F"/>
+          <w:bottom w:val="single" w:sz="6" w:space="1" w:color="2563EB"/>
         </w:pBdr>
       </w:pPr>
       <w:r>
         <w:rPr>
+          <w:rFonts w:ascii="Calibri" w:hAnsi="Calibri"/>
           <w:b/>
-          <w:color w:val="18212F"/>
-          <w:sz w:val="23"/>
+          <w:color w:val="2563EB"/>
+          <w:sz w:val="21"/>
         </w:rPr>
-        <w:t>SKILLS</w:t>
+        <w:t>TECHNICAL SKILLS</w:t>
       </w:r>
     </w:p>
     <w:p>
       <w:pPr>
-        <w:spacing w:before="20" w:after="40" w:line="264" w:lineRule="auto"/>
+        <w:spacing w:before="0" w:after="30" w:line="259" w:lineRule="auto"/>
       </w:pPr>
       <w:r>
         <w:rPr>
+          <w:rFonts w:ascii="Calibri" w:hAnsi="Calibri"/>
           <w:b/>
-          <w:sz w:val="20"/>
+          <w:color w:val="0F172A"/>
+          <w:sz w:val="19"/>
         </w:rPr>
         <w:t xml:space="preserve">Frontend &amp; Mobile: </w:t>
       </w:r>
       <w:r>
         <w:rPr>
-          <w:sz w:val="20"/>
+          <w:rFonts w:ascii="Calibri" w:hAnsi="Calibri"/>
+          <w:color w:val="1E293B"/>
+          <w:sz w:val="19"/>
         </w:rPr>
         <w:t>React 19, React Router v7, TypeScript, Tailwind CSS v4, shadcn/ui, TanStack Query/Table, Next.js, Redux, Android Jetpack (Kotlin/Java), Vite, Bun</w:t>
       </w:r>
     </w:p>
     <w:p>
       <w:pPr>
-        <w:spacing w:before="20" w:after="40" w:line="264" w:lineRule="auto"/>
+        <w:spacing w:before="0" w:after="30" w:line="259" w:lineRule="auto"/>
       </w:pPr>
       <w:r>
         <w:rPr>
+          <w:rFonts w:ascii="Calibri" w:hAnsi="Calibri"/>
           <w:b/>
-          <w:sz w:val="20"/>
+          <w:color w:val="0F172A"/>
+          <w:sz w:val="19"/>
         </w:rPr>
         <w:t xml:space="preserve">Backend &amp; Web3: </w:t>
       </w:r>
       <w:r>
         <w:rPr>
-          <w:sz w:val="20"/>
+          <w:rFonts w:ascii="Calibri" w:hAnsi="Calibri"/>
+          <w:color w:val="1E293B"/>
+          <w:sz w:val="19"/>
         </w:rPr>
         <w:t>Laravel (PHP), Node.js, RESTful APIs, GraphQL, TON SDK, Smart Contracts (Solidity), Telegram Bot API, Pusher JS (WebSockets)</w:t>
       </w:r>
     </w:p>
     <w:p>
       <w:pPr>
-        <w:spacing w:before="20" w:after="40" w:line="264" w:lineRule="auto"/>
+        <w:spacing w:before="0" w:after="30" w:line="259" w:lineRule="auto"/>
       </w:pPr>
       <w:r>
         <w:rPr>
+          <w:rFonts w:ascii="Calibri" w:hAnsi="Calibri"/>
           <w:b/>
-          <w:sz w:val="20"/>
+          <w:color w:val="0F172A"/>
+          <w:sz w:val="19"/>
         </w:rPr>
         <w:t xml:space="preserve">Programming Languages: </w:t>
       </w:r>
       <w:r>
         <w:rPr>
-          <w:sz w:val="20"/>
+          <w:rFonts w:ascii="Calibri" w:hAnsi="Calibri"/>
+          <w:color w:val="1E293B"/>
+          <w:sz w:val="19"/>
         </w:rPr>
         <w:t>TypeScript, JavaScript, PHP, Kotlin, Java, Solidity, Python, SQL, HTML5, CSS3</w:t>
       </w:r>
     </w:p>
     <w:p>
       <w:pPr>
-        <w:spacing w:before="20" w:after="40" w:line="264" w:lineRule="auto"/>
+        <w:spacing w:before="0" w:after="30" w:line="259" w:lineRule="auto"/>
       </w:pPr>
       <w:r>
         <w:rPr>
+          <w:rFonts w:ascii="Calibri" w:hAnsi="Calibri"/>
           <w:b/>
-          <w:sz w:val="20"/>
+          <w:color w:val="0F172A"/>
+          <w:sz w:val="19"/>
         </w:rPr>
         <w:t xml:space="preserve">Databases &amp; ORMs: </w:t>
       </w:r>
       <w:r>
         <w:rPr>
-          <w:sz w:val="20"/>
+          <w:rFonts w:ascii="Calibri" w:hAnsi="Calibri"/>
+          <w:color w:val="1E293B"/>
+          <w:sz w:val="19"/>
         </w:rPr>
         <w:t>MySQL, PostgreSQL, MongoDB, Prisma ORM, Drizzle ORM, Room Database</w:t>
       </w:r>
     </w:p>
     <w:p>
       <w:pPr>
-        <w:spacing w:before="20" w:after="40" w:line="264" w:lineRule="auto"/>
+        <w:spacing w:before="0" w:after="30" w:line="259" w:lineRule="auto"/>
       </w:pPr>
       <w:r>
         <w:rPr>
+          <w:rFonts w:ascii="Calibri" w:hAnsi="Calibri"/>
           <w:b/>
-          <w:sz w:val="20"/>
+          <w:color w:val="0F172A"/>
+          <w:sz w:val="19"/>
         </w:rPr>
         <w:t xml:space="preserve">DevOps &amp; Tools: </w:t>
       </w:r>
       <w:r>
         <w:rPr>
-          <w:sz w:val="20"/>
+          <w:rFonts w:ascii="Calibri" w:hAnsi="Calibri"/>
+          <w:color w:val="1E293B"/>
+          <w:sz w:val="19"/>
         </w:rPr>
         <w:t>Git, Docker, Linux/SSH, Vercel, Firebase, Plesk, cPanel, Jira, Slack, VS Code, Android Studio, Sentry, Figma, Recharts, Zod</w:t>
       </w:r>
     </w:p>
     <w:p>
       <w:pPr>
-        <w:spacing w:before="20" w:after="40" w:line="264" w:lineRule="auto"/>
+        <w:spacing w:before="0" w:after="30" w:line="259" w:lineRule="auto"/>
       </w:pPr>
       <w:r>
         <w:rPr>
+          <w:rFonts w:ascii="Calibri" w:hAnsi="Calibri"/>
           <w:b/>
-          <w:sz w:val="20"/>
+          <w:color w:val="0F172A"/>
+          <w:sz w:val="19"/>
         </w:rPr>
         <w:t xml:space="preserve">Core Competencies: </w:t>
       </w:r>
       <w:r>
         <w:rPr>
-          <w:sz w:val="20"/>
+          <w:rFonts w:ascii="Calibri" w:hAnsi="Calibri"/>
+          <w:color w:val="1E293B"/>
+          <w:sz w:val="19"/>
         </w:rPr>
         <w:t>Real-time WebSocket Streaming, Type-safe Clean Architecture, MVVM, Payment Gateway Integration, Agile/Scrum Methodologies</w:t>
       </w:r>
@@ -654,16 +748,17 @@
     <w:p>
       <w:pPr>
         <w:keepNext/>
-        <w:spacing w:before="160" w:after="60"/>
+        <w:spacing w:before="140" w:after="40"/>
         <w:pBdr>
-          <w:bottom w:val="single" w:sz="6" w:space="2" w:color="18212F"/>
+          <w:bottom w:val="single" w:sz="6" w:space="1" w:color="2563EB"/>
         </w:pBdr>
       </w:pPr>
       <w:r>
         <w:rPr>
+          <w:rFonts w:ascii="Calibri" w:hAnsi="Calibri"/>
           <w:b/>
-          <w:color w:val="18212F"/>
-          <w:sz w:val="23"/>
+          <w:color w:val="2563EB"/>
+          <w:sz w:val="21"/>
         </w:rPr>
         <w:t>EDUCATION</w:t>
       </w:r>
@@ -676,51 +771,54 @@
         <w:tblLook w:firstColumn="1" w:firstRow="1" w:lastColumn="0" w:lastRow="0" w:noHBand="0" w:noVBand="1" w:val="04A0"/>
       </w:tblPr>
       <w:tblGrid>
-        <w:gridCol w:w="7776"/>
-        <w:gridCol w:w="2736"/>
+        <w:gridCol w:w="5400"/>
+        <w:gridCol w:w="5400"/>
       </w:tblGrid>
       <w:tr>
         <w:tc>
           <w:tcPr>
-            <w:tcW w:type="dxa" w:w="5256"/>
+            <w:tcW w:type="dxa" w:w="8064"/>
             <w:tcMar>
-              <w:top w:w="20" w:type="dxa"/>
-              <w:bottom w:w="5" w:type="dxa"/>
+              <w:top w:w="0" w:type="dxa"/>
+              <w:bottom w:w="0" w:type="dxa"/>
               <w:left w:w="0" w:type="dxa"/>
               <w:right w:w="0" w:type="dxa"/>
             </w:tcMar>
           </w:tcPr>
           <w:p>
             <w:pPr>
-              <w:spacing w:before="60" w:after="20"/>
+              <w:spacing w:before="40" w:after="20" w:line="252" w:lineRule="auto"/>
             </w:pPr>
             <w:r>
               <w:rPr>
+                <w:rFonts w:ascii="Calibri" w:hAnsi="Calibri"/>
                 <w:b/>
-                <w:color w:val="18212F"/>
-                <w:sz w:val="21"/>
+                <w:color w:val="0F172A"/>
+                <w:sz w:val="20"/>
               </w:rPr>
-              <w:t>Institut Teknologi Sepuluh Nopember (ITS) | Bachelor of Computer Science (S.Kom.)</w:t>
+              <w:t>Institut Teknologi Sepuluh Nopember (ITS) | Bachelor of Computer Science (S.Kom.) in Informatics Engineering</w:t>
             </w:r>
           </w:p>
         </w:tc>
         <w:tc>
           <w:tcPr>
-            <w:tcW w:type="dxa" w:w="5256"/>
+            <w:tcW w:type="dxa" w:w="2736"/>
             <w:tcMar>
-              <w:top w:w="20" w:type="dxa"/>
-              <w:bottom w:w="5" w:type="dxa"/>
+              <w:top w:w="0" w:type="dxa"/>
+              <w:bottom w:w="0" w:type="dxa"/>
               <w:left w:w="0" w:type="dxa"/>
               <w:right w:w="0" w:type="dxa"/>
             </w:tcMar>
           </w:tcPr>
           <w:p>
             <w:pPr>
-              <w:spacing w:before="60" w:after="20"/>
+              <w:spacing w:before="40" w:after="20" w:line="252" w:lineRule="auto"/>
               <w:jc w:val="right"/>
             </w:pPr>
             <w:r>
               <w:rPr>
+                <w:rFonts w:ascii="Calibri" w:hAnsi="Calibri"/>
+                <w:i/>
                 <w:color w:val="475569"/>
                 <w:sz w:val="19"/>
               </w:rPr>
@@ -732,29 +830,31 @@
     </w:tbl>
     <w:p>
       <w:pPr>
-        <w:spacing w:before="0" w:after="80"/>
+        <w:spacing w:before="0" w:after="60"/>
       </w:pPr>
       <w:r>
         <w:rPr>
+          <w:rFonts w:ascii="Calibri" w:hAnsi="Calibri"/>
           <w:color w:val="475569"/>
-          <w:sz w:val="19"/>
+          <w:sz w:val="18"/>
         </w:rPr>
-        <w:t>Bachelor of Computer Science (S.Kom.) | GPA: 3.42 / 4.00 | Focus: Network Centric Computing &amp; Distributed Systems</w:t>
+        <w:t>GPA: 3.42 / 4.00  |  Focus Area: Network Centric Computing &amp; Distributed Systems</w:t>
       </w:r>
     </w:p>
     <w:p>
       <w:pPr>
         <w:keepNext/>
-        <w:spacing w:before="160" w:after="60"/>
+        <w:spacing w:before="140" w:after="40"/>
         <w:pBdr>
-          <w:bottom w:val="single" w:sz="6" w:space="2" w:color="18212F"/>
+          <w:bottom w:val="single" w:sz="6" w:space="1" w:color="2563EB"/>
         </w:pBdr>
       </w:pPr>
       <w:r>
         <w:rPr>
+          <w:rFonts w:ascii="Calibri" w:hAnsi="Calibri"/>
           <w:b/>
-          <w:color w:val="18212F"/>
-          <w:sz w:val="23"/>
+          <w:color w:val="2563EB"/>
+          <w:sz w:val="21"/>
         </w:rPr>
         <w:t>CERTIFICATIONS</w:t>
       </w:r>
@@ -767,29 +867,30 @@
         <w:tblLook w:firstColumn="1" w:firstRow="1" w:lastColumn="0" w:lastRow="0" w:noHBand="0" w:noVBand="1" w:val="04A0"/>
       </w:tblPr>
       <w:tblGrid>
-        <w:gridCol w:w="7776"/>
-        <w:gridCol w:w="2736"/>
+        <w:gridCol w:w="5400"/>
+        <w:gridCol w:w="5400"/>
       </w:tblGrid>
       <w:tr>
         <w:tc>
           <w:tcPr>
-            <w:tcW w:type="dxa" w:w="5256"/>
+            <w:tcW w:type="dxa" w:w="8064"/>
             <w:tcMar>
-              <w:top w:w="20" w:type="dxa"/>
-              <w:bottom w:w="5" w:type="dxa"/>
+              <w:top w:w="0" w:type="dxa"/>
+              <w:bottom w:w="0" w:type="dxa"/>
               <w:left w:w="0" w:type="dxa"/>
               <w:right w:w="0" w:type="dxa"/>
             </w:tcMar>
           </w:tcPr>
           <w:p>
             <w:pPr>
-              <w:spacing w:before="60" w:after="20"/>
+              <w:spacing w:before="40" w:after="20" w:line="252" w:lineRule="auto"/>
             </w:pPr>
             <w:r>
               <w:rPr>
+                <w:rFonts w:ascii="Calibri" w:hAnsi="Calibri"/>
                 <w:b/>
-                <w:color w:val="18212F"/>
-                <w:sz w:val="21"/>
+                <w:color w:val="0F172A"/>
+                <w:sz w:val="20"/>
               </w:rPr>
               <w:t>Belajar Fundamental Aplikasi Web dengan React | Dicoding Indonesia</w:t>
             </w:r>
@@ -797,21 +898,23 @@
         </w:tc>
         <w:tc>
           <w:tcPr>
-            <w:tcW w:type="dxa" w:w="5256"/>
+            <w:tcW w:type="dxa" w:w="2736"/>
             <w:tcMar>
-              <w:top w:w="20" w:type="dxa"/>
-              <w:bottom w:w="5" w:type="dxa"/>
+              <w:top w:w="0" w:type="dxa"/>
+              <w:bottom w:w="0" w:type="dxa"/>
               <w:left w:w="0" w:type="dxa"/>
               <w:right w:w="0" w:type="dxa"/>
             </w:tcMar>
           </w:tcPr>
           <w:p>
             <w:pPr>
-              <w:spacing w:before="60" w:after="20"/>
+              <w:spacing w:before="40" w:after="20" w:line="252" w:lineRule="auto"/>
               <w:jc w:val="right"/>
             </w:pPr>
             <w:r>
               <w:rPr>
+                <w:rFonts w:ascii="Calibri" w:hAnsi="Calibri"/>
+                <w:i/>
                 <w:color w:val="475569"/>
                 <w:sz w:val="19"/>
               </w:rPr>
@@ -823,15 +926,16 @@
     </w:tbl>
     <w:p>
       <w:pPr>
-        <w:spacing w:before="0" w:after="60"/>
-        <w:ind w:left="288"/>
+        <w:spacing w:before="0" w:after="40"/>
+        <w:ind w:left="216"/>
       </w:pPr>
       <w:r>
         <w:rPr>
+          <w:rFonts w:ascii="Calibri" w:hAnsi="Calibri"/>
           <w:color w:val="475569"/>
-          <w:sz w:val="19"/>
+          <w:sz w:val="18"/>
         </w:rPr>
-        <w:t>Focus: Single Page Application (SPA), React.js, Tailwind CSS, Vite</w:t>
+        <w:t>Core Focus: Single Page Application (SPA), React.js, Tailwind CSS, Vite</w:t>
       </w:r>
     </w:p>
     <w:tbl>
@@ -842,29 +946,30 @@
         <w:tblLook w:firstColumn="1" w:firstRow="1" w:lastColumn="0" w:lastRow="0" w:noHBand="0" w:noVBand="1" w:val="04A0"/>
       </w:tblPr>
       <w:tblGrid>
-        <w:gridCol w:w="7776"/>
-        <w:gridCol w:w="2736"/>
+        <w:gridCol w:w="5400"/>
+        <w:gridCol w:w="5400"/>
       </w:tblGrid>
       <w:tr>
         <w:tc>
           <w:tcPr>
-            <w:tcW w:type="dxa" w:w="5256"/>
+            <w:tcW w:type="dxa" w:w="8064"/>
             <w:tcMar>
-              <w:top w:w="20" w:type="dxa"/>
-              <w:bottom w:w="5" w:type="dxa"/>
+              <w:top w:w="0" w:type="dxa"/>
+              <w:bottom w:w="0" w:type="dxa"/>
               <w:left w:w="0" w:type="dxa"/>
               <w:right w:w="0" w:type="dxa"/>
             </w:tcMar>
           </w:tcPr>
           <w:p>
             <w:pPr>
-              <w:spacing w:before="60" w:after="20"/>
+              <w:spacing w:before="40" w:after="20" w:line="252" w:lineRule="auto"/>
             </w:pPr>
             <w:r>
               <w:rPr>
+                <w:rFonts w:ascii="Calibri" w:hAnsi="Calibri"/>
                 <w:b/>
-                <w:color w:val="18212F"/>
-                <w:sz w:val="21"/>
+                <w:color w:val="0F172A"/>
+                <w:sz w:val="20"/>
               </w:rPr>
               <w:t>Belajar Analisis Data dengan Python | Dicoding Indonesia</w:t>
             </w:r>
@@ -872,21 +977,23 @@
         </w:tc>
         <w:tc>
           <w:tcPr>
-            <w:tcW w:type="dxa" w:w="5256"/>
+            <w:tcW w:type="dxa" w:w="2736"/>
             <w:tcMar>
-              <w:top w:w="20" w:type="dxa"/>
-              <w:bottom w:w="5" w:type="dxa"/>
+              <w:top w:w="0" w:type="dxa"/>
+              <w:bottom w:w="0" w:type="dxa"/>
               <w:left w:w="0" w:type="dxa"/>
               <w:right w:w="0" w:type="dxa"/>
             </w:tcMar>
           </w:tcPr>
           <w:p>
             <w:pPr>
-              <w:spacing w:before="60" w:after="20"/>
+              <w:spacing w:before="40" w:after="20" w:line="252" w:lineRule="auto"/>
               <w:jc w:val="right"/>
             </w:pPr>
             <w:r>
               <w:rPr>
+                <w:rFonts w:ascii="Calibri" w:hAnsi="Calibri"/>
+                <w:i/>
                 <w:color w:val="475569"/>
                 <w:sz w:val="19"/>
               </w:rPr>
@@ -898,15 +1005,16 @@
     </w:tbl>
     <w:p>
       <w:pPr>
-        <w:spacing w:before="0" w:after="60"/>
-        <w:ind w:left="288"/>
+        <w:spacing w:before="0" w:after="40"/>
+        <w:ind w:left="216"/>
       </w:pPr>
       <w:r>
         <w:rPr>
+          <w:rFonts w:ascii="Calibri" w:hAnsi="Calibri"/>
           <w:color w:val="475569"/>
-          <w:sz w:val="19"/>
+          <w:sz w:val="18"/>
         </w:rPr>
-        <w:t>Focus: Data Wrangling, Exploratory Data Analysis, Visualization</w:t>
+        <w:t>Core Focus: Data Wrangling, Exploratory Data Analysis, Visualization</w:t>
       </w:r>
     </w:p>
     <w:tbl>
@@ -917,29 +1025,30 @@
         <w:tblLook w:firstColumn="1" w:firstRow="1" w:lastColumn="0" w:lastRow="0" w:noHBand="0" w:noVBand="1" w:val="04A0"/>
       </w:tblPr>
       <w:tblGrid>
-        <w:gridCol w:w="7776"/>
-        <w:gridCol w:w="2736"/>
+        <w:gridCol w:w="5400"/>
+        <w:gridCol w:w="5400"/>
       </w:tblGrid>
       <w:tr>
         <w:tc>
           <w:tcPr>
-            <w:tcW w:type="dxa" w:w="5256"/>
+            <w:tcW w:type="dxa" w:w="8064"/>
             <w:tcMar>
-              <w:top w:w="20" w:type="dxa"/>
-              <w:bottom w:w="5" w:type="dxa"/>
+              <w:top w:w="0" w:type="dxa"/>
+              <w:bottom w:w="0" w:type="dxa"/>
               <w:left w:w="0" w:type="dxa"/>
               <w:right w:w="0" w:type="dxa"/>
             </w:tcMar>
           </w:tcPr>
           <w:p>
             <w:pPr>
-              <w:spacing w:before="60" w:after="20"/>
+              <w:spacing w:before="40" w:after="20" w:line="252" w:lineRule="auto"/>
             </w:pPr>
             <w:r>
               <w:rPr>
+                <w:rFonts w:ascii="Calibri" w:hAnsi="Calibri"/>
                 <w:b/>
-                <w:color w:val="18212F"/>
-                <w:sz w:val="21"/>
+                <w:color w:val="0F172A"/>
+                <w:sz w:val="20"/>
               </w:rPr>
               <w:t>Menjadi Android Developer Expert (MADE) | Dicoding Indonesia</w:t>
             </w:r>
@@ -947,21 +1056,23 @@
         </w:tc>
         <w:tc>
           <w:tcPr>
-            <w:tcW w:type="dxa" w:w="5256"/>
+            <w:tcW w:type="dxa" w:w="2736"/>
             <w:tcMar>
-              <w:top w:w="20" w:type="dxa"/>
-              <w:bottom w:w="5" w:type="dxa"/>
+              <w:top w:w="0" w:type="dxa"/>
+              <w:bottom w:w="0" w:type="dxa"/>
               <w:left w:w="0" w:type="dxa"/>
               <w:right w:w="0" w:type="dxa"/>
             </w:tcMar>
           </w:tcPr>
           <w:p>
             <w:pPr>
-              <w:spacing w:before="60" w:after="20"/>
+              <w:spacing w:before="40" w:after="20" w:line="252" w:lineRule="auto"/>
               <w:jc w:val="right"/>
             </w:pPr>
             <w:r>
               <w:rPr>
+                <w:rFonts w:ascii="Calibri" w:hAnsi="Calibri"/>
+                <w:i/>
                 <w:color w:val="475569"/>
                 <w:sz w:val="19"/>
               </w:rPr>
@@ -973,15 +1084,16 @@
     </w:tbl>
     <w:p>
       <w:pPr>
-        <w:spacing w:before="0" w:after="60"/>
-        <w:ind w:left="288"/>
+        <w:spacing w:before="0" w:after="40"/>
+        <w:ind w:left="216"/>
       </w:pPr>
       <w:r>
         <w:rPr>
+          <w:rFonts w:ascii="Calibri" w:hAnsi="Calibri"/>
           <w:color w:val="475569"/>
-          <w:sz w:val="19"/>
+          <w:sz w:val="18"/>
         </w:rPr>
-        <w:t>Focus: Clean Architecture, MVVM Design Pattern, Room Database, App Security &amp; Certificate Pinning</w:t>
+        <w:t>Core Focus: Clean Architecture, MVVM Design Pattern, Room Database, App Security &amp; Certificate Pinning</w:t>
       </w:r>
     </w:p>
     <w:tbl>
@@ -992,29 +1104,30 @@
         <w:tblLook w:firstColumn="1" w:firstRow="1" w:lastColumn="0" w:lastRow="0" w:noHBand="0" w:noVBand="1" w:val="04A0"/>
       </w:tblPr>
       <w:tblGrid>
-        <w:gridCol w:w="7776"/>
-        <w:gridCol w:w="2736"/>
+        <w:gridCol w:w="5400"/>
+        <w:gridCol w:w="5400"/>
       </w:tblGrid>
       <w:tr>
         <w:tc>
           <w:tcPr>
-            <w:tcW w:type="dxa" w:w="5256"/>
+            <w:tcW w:type="dxa" w:w="8064"/>
             <w:tcMar>
-              <w:top w:w="20" w:type="dxa"/>
-              <w:bottom w:w="5" w:type="dxa"/>
+              <w:top w:w="0" w:type="dxa"/>
+              <w:bottom w:w="0" w:type="dxa"/>
               <w:left w:w="0" w:type="dxa"/>
               <w:right w:w="0" w:type="dxa"/>
             </w:tcMar>
           </w:tcPr>
           <w:p>
             <w:pPr>
-              <w:spacing w:before="60" w:after="20"/>
+              <w:spacing w:before="40" w:after="20" w:line="252" w:lineRule="auto"/>
             </w:pPr>
             <w:r>
               <w:rPr>
+                <w:rFonts w:ascii="Calibri" w:hAnsi="Calibri"/>
                 <w:b/>
-                <w:color w:val="18212F"/>
-                <w:sz w:val="21"/>
+                <w:color w:val="0F172A"/>
+                <w:sz w:val="20"/>
               </w:rPr>
               <w:t>Belajar Android Jetpack Pro | Dicoding Indonesia</w:t>
             </w:r>
@@ -1022,21 +1135,23 @@
         </w:tc>
         <w:tc>
           <w:tcPr>
-            <w:tcW w:type="dxa" w:w="5256"/>
+            <w:tcW w:type="dxa" w:w="2736"/>
             <w:tcMar>
-              <w:top w:w="20" w:type="dxa"/>
-              <w:bottom w:w="5" w:type="dxa"/>
+              <w:top w:w="0" w:type="dxa"/>
+              <w:bottom w:w="0" w:type="dxa"/>
               <w:left w:w="0" w:type="dxa"/>
               <w:right w:w="0" w:type="dxa"/>
             </w:tcMar>
           </w:tcPr>
           <w:p>
             <w:pPr>
-              <w:spacing w:before="60" w:after="20"/>
+              <w:spacing w:before="40" w:after="20" w:line="252" w:lineRule="auto"/>
               <w:jc w:val="right"/>
             </w:pPr>
             <w:r>
               <w:rPr>
+                <w:rFonts w:ascii="Calibri" w:hAnsi="Calibri"/>
+                <w:i/>
                 <w:color w:val="475569"/>
                 <w:sz w:val="19"/>
               </w:rPr>
@@ -1048,62 +1163,78 @@
     </w:tbl>
     <w:p>
       <w:pPr>
-        <w:spacing w:before="0" w:after="60"/>
-        <w:ind w:left="288"/>
+        <w:spacing w:before="0" w:after="40"/>
+        <w:ind w:left="216"/>
       </w:pPr>
       <w:r>
         <w:rPr>
+          <w:rFonts w:ascii="Calibri" w:hAnsi="Calibri"/>
           <w:color w:val="475569"/>
-          <w:sz w:val="19"/>
+          <w:sz w:val="18"/>
         </w:rPr>
-        <w:t>Focus: Android Architecture Components, LiveData, ViewModel, Room Library</w:t>
+        <w:t>Core Focus: Android Architecture Components, LiveData, ViewModel, Room Library</w:t>
       </w:r>
     </w:p>
     <w:p>
       <w:pPr>
         <w:keepNext/>
-        <w:spacing w:before="160" w:after="60"/>
+        <w:spacing w:before="140" w:after="40"/>
         <w:pBdr>
-          <w:bottom w:val="single" w:sz="6" w:space="2" w:color="18212F"/>
+          <w:bottom w:val="single" w:sz="6" w:space="1" w:color="2563EB"/>
         </w:pBdr>
       </w:pPr>
       <w:r>
         <w:rPr>
+          <w:rFonts w:ascii="Calibri" w:hAnsi="Calibri"/>
           <w:b/>
-          <w:color w:val="18212F"/>
-          <w:sz w:val="23"/>
+          <w:color w:val="2563EB"/>
+          <w:sz w:val="21"/>
         </w:rPr>
         <w:t>LANGUAGES</w:t>
       </w:r>
     </w:p>
     <w:p>
       <w:pPr>
-        <w:spacing w:before="40" w:after="80"/>
+        <w:spacing w:before="20" w:after="80"/>
       </w:pPr>
       <w:r>
         <w:rPr>
+          <w:rFonts w:ascii="Calibri" w:hAnsi="Calibri"/>
           <w:b/>
-          <w:sz w:val="20"/>
+          <w:color w:val="0F172A"/>
+          <w:sz w:val="19"/>
         </w:rPr>
         <w:t xml:space="preserve">Indonesian: </w:t>
       </w:r>
       <w:r>
+        <w:rPr>
+          <w:rFonts w:ascii="Calibri" w:hAnsi="Calibri"/>
+          <w:color w:val="1E293B"/>
+          <w:sz w:val="19"/>
+        </w:rPr>
         <w:t xml:space="preserve">Native proficiency    </w:t>
       </w:r>
       <w:r>
         <w:rPr>
+          <w:rFonts w:ascii="Calibri" w:hAnsi="Calibri"/>
           <w:b/>
-          <w:sz w:val="20"/>
+          <w:color w:val="0F172A"/>
+          <w:sz w:val="19"/>
         </w:rPr>
         <w:t xml:space="preserve">English: </w:t>
       </w:r>
       <w:r>
+        <w:rPr>
+          <w:rFonts w:ascii="Calibri" w:hAnsi="Calibri"/>
+          <w:color w:val="1E293B"/>
+          <w:sz w:val="19"/>
+        </w:rPr>
         <w:t xml:space="preserve">Professional working proficiency    </w:t>
       </w:r>
     </w:p>
     <w:sectPr>
       <w:pgSz w:w="12240" w:h="15840"/>
-      <w:pgMar w:top="792" w:right="864" w:bottom="792" w:left="864" w:header="720" w:footer="720" w:gutter="0"/>
+      <w:pgMar w:top="691" w:right="720" w:bottom="691" w:left="720" w:header="720" w:footer="720" w:gutter="0"/>
       <w:cols w:space="720"/>
       <w:docGrid w:linePitch="360"/>
     </w:sectPr>
@@ -1474,11 +1605,6 @@
     <w:name w:val="Normal"/>
     <w:qFormat/>
     <w:rsid w:val="00FC693F"/>
-    <w:rPr>
-      <w:rFonts w:ascii="Times New Roman" w:hAnsi="Times New Roman"/>
-      <w:color w:val="212529"/>
-      <w:sz w:val="21"/>
-    </w:rPr>
   </w:style>
   <w:style w:type="paragraph" w:styleId="Header">
     <w:name w:val="header"/>

</xml_diff>

<commit_message>
style: optimize resume layout ensuring employment tenure and date ranges strictly fit on 1 single line
</commit_message>
<xml_diff>
--- a/output/Muhamad_Hendri_Febriansyah_Resume.docx
+++ b/output/Muhamad_Hendri_Febriansyah_Resume.docx
@@ -94,7 +94,7 @@
       <w:tr>
         <w:tc>
           <w:tcPr>
-            <w:tcW w:type="dxa" w:w="8064"/>
+            <w:tcW w:type="dxa" w:w="7632"/>
             <w:tcMar>
               <w:top w:w="0" w:type="dxa"/>
               <w:bottom w:w="0" w:type="dxa"/>
@@ -113,13 +113,13 @@
                 <w:color w:val="0F172A"/>
                 <w:sz w:val="20"/>
               </w:rPr>
-              <w:t>Freelance Software Engineer | PT Lapantiga Solusi Algoritma</w:t>
+              <w:t>Freelance Software Engineer | PT Lapantiga Solusi Algoritma (Surabaya, Indonesia)</w:t>
             </w:r>
           </w:p>
         </w:tc>
         <w:tc>
           <w:tcPr>
-            <w:tcW w:type="dxa" w:w="2736"/>
+            <w:tcW w:type="dxa" w:w="3168"/>
             <w:tcMar>
               <w:top w:w="0" w:type="dxa"/>
               <w:bottom w:w="0" w:type="dxa"/>
@@ -139,7 +139,7 @@
                 <w:color w:val="475569"/>
                 <w:sz w:val="19"/>
               </w:rPr>
-              <w:t>Surabaya, Indonesia  •  Jan 2019 – Present</w:t>
+              <w:t>Jan 2019 – Present</w:t>
             </w:r>
           </w:p>
         </w:tc>
@@ -234,7 +234,7 @@
       <w:tr>
         <w:tc>
           <w:tcPr>
-            <w:tcW w:type="dxa" w:w="8064"/>
+            <w:tcW w:type="dxa" w:w="7632"/>
             <w:tcMar>
               <w:top w:w="0" w:type="dxa"/>
               <w:bottom w:w="0" w:type="dxa"/>
@@ -253,13 +253,13 @@
                 <w:color w:val="0F172A"/>
                 <w:sz w:val="20"/>
               </w:rPr>
-              <w:t>Full Stack Developer (Web3 &amp; AI) | Kipley Pte. Ltd.</w:t>
+              <w:t>Full Stack Developer (Web3 &amp; AI) | Kipley Pte. Ltd. (Singapore (Remote))</w:t>
             </w:r>
           </w:p>
         </w:tc>
         <w:tc>
           <w:tcPr>
-            <w:tcW w:type="dxa" w:w="2736"/>
+            <w:tcW w:type="dxa" w:w="3168"/>
             <w:tcMar>
               <w:top w:w="0" w:type="dxa"/>
               <w:bottom w:w="0" w:type="dxa"/>
@@ -279,7 +279,7 @@
                 <w:color w:val="475569"/>
                 <w:sz w:val="19"/>
               </w:rPr>
-              <w:t>Singapore (Remote)  •  Nov 2024 – Jul 2025</w:t>
+              <w:t>Nov 2024 – Jul 2025</w:t>
             </w:r>
           </w:p>
         </w:tc>
@@ -359,7 +359,7 @@
       <w:tr>
         <w:tc>
           <w:tcPr>
-            <w:tcW w:type="dxa" w:w="8064"/>
+            <w:tcW w:type="dxa" w:w="7632"/>
             <w:tcMar>
               <w:top w:w="0" w:type="dxa"/>
               <w:bottom w:w="0" w:type="dxa"/>
@@ -378,13 +378,13 @@
                 <w:color w:val="0F172A"/>
                 <w:sz w:val="20"/>
               </w:rPr>
-              <w:t>Android Developer | PT Aku Pintar Indonesia</w:t>
+              <w:t>Android Developer | PT Aku Pintar Indonesia (Surabaya, Indonesia)</w:t>
             </w:r>
           </w:p>
         </w:tc>
         <w:tc>
           <w:tcPr>
-            <w:tcW w:type="dxa" w:w="2736"/>
+            <w:tcW w:type="dxa" w:w="3168"/>
             <w:tcMar>
               <w:top w:w="0" w:type="dxa"/>
               <w:bottom w:w="0" w:type="dxa"/>
@@ -404,7 +404,7 @@
                 <w:color w:val="475569"/>
                 <w:sz w:val="19"/>
               </w:rPr>
-              <w:t>Surabaya, Indonesia  •  Feb 2021 – May 2024</w:t>
+              <w:t>Feb 2021 – May 2024</w:t>
             </w:r>
           </w:p>
         </w:tc>
@@ -484,7 +484,7 @@
       <w:tr>
         <w:tc>
           <w:tcPr>
-            <w:tcW w:type="dxa" w:w="8064"/>
+            <w:tcW w:type="dxa" w:w="7632"/>
             <w:tcMar>
               <w:top w:w="0" w:type="dxa"/>
               <w:bottom w:w="0" w:type="dxa"/>
@@ -503,13 +503,13 @@
                 <w:color w:val="0F172A"/>
                 <w:sz w:val="20"/>
               </w:rPr>
-              <w:t>Software Developer | PT Qira Teknologi Indonesia</w:t>
+              <w:t>Software Developer | PT Qira Teknologi Indonesia (Surabaya, Indonesia)</w:t>
             </w:r>
           </w:p>
         </w:tc>
         <w:tc>
           <w:tcPr>
-            <w:tcW w:type="dxa" w:w="2736"/>
+            <w:tcW w:type="dxa" w:w="3168"/>
             <w:tcMar>
               <w:top w:w="0" w:type="dxa"/>
               <w:bottom w:w="0" w:type="dxa"/>
@@ -529,7 +529,7 @@
                 <w:color w:val="475569"/>
                 <w:sz w:val="19"/>
               </w:rPr>
-              <w:t>Surabaya, Indonesia  •  Nov 2020 – Jan 2024</w:t>
+              <w:t>Nov 2020 – Jan 2024</w:t>
             </w:r>
           </w:p>
         </w:tc>
@@ -777,7 +777,7 @@
       <w:tr>
         <w:tc>
           <w:tcPr>
-            <w:tcW w:type="dxa" w:w="8064"/>
+            <w:tcW w:type="dxa" w:w="7632"/>
             <w:tcMar>
               <w:top w:w="0" w:type="dxa"/>
               <w:bottom w:w="0" w:type="dxa"/>
@@ -802,7 +802,7 @@
         </w:tc>
         <w:tc>
           <w:tcPr>
-            <w:tcW w:type="dxa" w:w="2736"/>
+            <w:tcW w:type="dxa" w:w="3168"/>
             <w:tcMar>
               <w:top w:w="0" w:type="dxa"/>
               <w:bottom w:w="0" w:type="dxa"/>
@@ -873,7 +873,7 @@
       <w:tr>
         <w:tc>
           <w:tcPr>
-            <w:tcW w:type="dxa" w:w="8064"/>
+            <w:tcW w:type="dxa" w:w="7632"/>
             <w:tcMar>
               <w:top w:w="0" w:type="dxa"/>
               <w:bottom w:w="0" w:type="dxa"/>
@@ -898,7 +898,7 @@
         </w:tc>
         <w:tc>
           <w:tcPr>
-            <w:tcW w:type="dxa" w:w="2736"/>
+            <w:tcW w:type="dxa" w:w="3168"/>
             <w:tcMar>
               <w:top w:w="0" w:type="dxa"/>
               <w:bottom w:w="0" w:type="dxa"/>
@@ -952,7 +952,7 @@
       <w:tr>
         <w:tc>
           <w:tcPr>
-            <w:tcW w:type="dxa" w:w="8064"/>
+            <w:tcW w:type="dxa" w:w="7632"/>
             <w:tcMar>
               <w:top w:w="0" w:type="dxa"/>
               <w:bottom w:w="0" w:type="dxa"/>
@@ -977,7 +977,7 @@
         </w:tc>
         <w:tc>
           <w:tcPr>
-            <w:tcW w:type="dxa" w:w="2736"/>
+            <w:tcW w:type="dxa" w:w="3168"/>
             <w:tcMar>
               <w:top w:w="0" w:type="dxa"/>
               <w:bottom w:w="0" w:type="dxa"/>
@@ -1031,7 +1031,7 @@
       <w:tr>
         <w:tc>
           <w:tcPr>
-            <w:tcW w:type="dxa" w:w="8064"/>
+            <w:tcW w:type="dxa" w:w="7632"/>
             <w:tcMar>
               <w:top w:w="0" w:type="dxa"/>
               <w:bottom w:w="0" w:type="dxa"/>
@@ -1056,7 +1056,7 @@
         </w:tc>
         <w:tc>
           <w:tcPr>
-            <w:tcW w:type="dxa" w:w="2736"/>
+            <w:tcW w:type="dxa" w:w="3168"/>
             <w:tcMar>
               <w:top w:w="0" w:type="dxa"/>
               <w:bottom w:w="0" w:type="dxa"/>
@@ -1110,7 +1110,7 @@
       <w:tr>
         <w:tc>
           <w:tcPr>
-            <w:tcW w:type="dxa" w:w="8064"/>
+            <w:tcW w:type="dxa" w:w="7632"/>
             <w:tcMar>
               <w:top w:w="0" w:type="dxa"/>
               <w:bottom w:w="0" w:type="dxa"/>
@@ -1135,7 +1135,7 @@
         </w:tc>
         <w:tc>
           <w:tcPr>
-            <w:tcW w:type="dxa" w:w="2736"/>
+            <w:tcW w:type="dxa" w:w="3168"/>
             <w:tcMar>
               <w:top w:w="0" w:type="dxa"/>
               <w:bottom w:w="0" w:type="dxa"/>

</xml_diff>